<commit_message>
Update hourly billing rates and role titles
- Staff Accountant $100/hr, Controller $185/hr, CFO $250/hr
- Rename roles: staff->Staff Accountant, controller->Controller,
  [Principal Name]/quality assurance->CFO (rate + time-estimate tables)
- Preserve tab alignment and [hours] form fields
- Fixed-fee version has no rate/time tables, so unchanged

Co-Authored-By: Claude Opus 4.8 <noreply@anthropic.com>
Claude-Session: https://claude.ai/code/session_01DN4EejCmNTZeYY4X9coMuA
</commit_message>
<xml_diff>
--- a/Onyx_Engagement_Letter_HOURLY.docx
+++ b/Onyx_Engagement_Letter_HOURLY.docx
@@ -1927,7 +1927,7 @@
         <w:rPr>
           <w:highlight w:val="yellow"/>
         </w:rPr>
-        <w:t>Services performed by staff</w:t>
+        <w:t>Services performed by Staff Accountant</w:t>
       </w:r>
       <w:r>
         <w:rPr>
@@ -1976,7 +1976,7 @@
         <w:rPr>
           <w:highlight w:val="yellow"/>
         </w:rPr>
-        <w:t>$  45</w:t>
+        <w:t>$100</w:t>
       </w:r>
       <w:proofErr w:type="gramEnd"/>
       <w:r>
@@ -1999,7 +1999,7 @@
         <w:rPr>
           <w:highlight w:val="yellow"/>
         </w:rPr>
-        <w:t>Services performed by controller</w:t>
+        <w:t>Services performed by Controller</w:t>
       </w:r>
       <w:r>
         <w:rPr>
@@ -2036,7 +2036,7 @@
           <w:highlight w:val="yellow"/>
         </w:rPr>
         <w:tab/>
-        <w:t>$100 per hour</w:t>
+        <w:t>$185 per hour</w:t>
       </w:r>
     </w:p>
     <w:p>
@@ -2061,7 +2061,7 @@
             <w:enabled/>
             <w:calcOnExit w:val="0"/>
             <w:textInput>
-              <w:default w:val="[Principal Name]"/>
+              <w:default w:val="CFO"/>
             </w:textInput>
           </w:ffData>
         </w:fldChar>
@@ -2076,7 +2076,7 @@
         <w:rPr>
           <w:noProof/>
         </w:rPr>
-        <w:t>[Principal Name]</w:t>
+        <w:t>CFO</w:t>
       </w:r>
       <w:r>
         <w:fldChar w:fldCharType="end"/>
@@ -2085,7 +2085,7 @@
         <w:rPr>
           <w:highlight w:val="yellow"/>
         </w:rPr>
-        <w:t>/quality assurance</w:t>
+        <w:t/>
       </w:r>
       <w:r>
         <w:rPr>
@@ -2104,7 +2104,7 @@
           <w:highlight w:val="yellow"/>
         </w:rPr>
         <w:tab/>
-        <w:t>$175 per hour</w:t>
+        <w:t>$250 per hour</w:t>
       </w:r>
     </w:p>
     <w:p>
@@ -2260,7 +2260,7 @@
         <w:rPr>
           <w:highlight w:val="yellow"/>
         </w:rPr>
-        <w:t>Services performed by staff</w:t>
+        <w:t>Services performed by Staff Accountant</w:t>
       </w:r>
       <w:r>
         <w:rPr>
@@ -2345,7 +2345,7 @@
         <w:rPr>
           <w:highlight w:val="yellow"/>
         </w:rPr>
-        <w:t>Services performed by controller</w:t>
+        <w:t>Services performed by Controller</w:t>
       </w:r>
       <w:r>
         <w:rPr>
@@ -2433,7 +2433,7 @@
             <w:enabled/>
             <w:calcOnExit w:val="0"/>
             <w:textInput>
-              <w:default w:val="[Principal Name]"/>
+              <w:default w:val="CFO"/>
             </w:textInput>
           </w:ffData>
         </w:fldChar>
@@ -2448,7 +2448,7 @@
         <w:rPr>
           <w:noProof/>
         </w:rPr>
-        <w:t>[Principal Name]</w:t>
+        <w:t>CFO</w:t>
       </w:r>
       <w:r>
         <w:fldChar w:fldCharType="end"/>
@@ -2457,7 +2457,7 @@
         <w:rPr>
           <w:highlight w:val="yellow"/>
         </w:rPr>
-        <w:t>/quality assurance</w:t>
+        <w:t/>
       </w:r>
       <w:r>
         <w:rPr>
@@ -2523,7 +2523,7 @@
         <w:rPr>
           <w:highlight w:val="yellow"/>
         </w:rPr>
-        <w:t>Services performed by staff</w:t>
+        <w:t>Services performed by Staff Accountant</w:t>
       </w:r>
       <w:r>
         <w:rPr>
@@ -2625,7 +2625,7 @@
         <w:rPr>
           <w:highlight w:val="yellow"/>
         </w:rPr>
-        <w:t xml:space="preserve"> by controller</w:t>
+        <w:t xml:space="preserve"> by Controller</w:t>
       </w:r>
       <w:r>
         <w:rPr>
@@ -2713,7 +2713,7 @@
             <w:enabled/>
             <w:calcOnExit w:val="0"/>
             <w:textInput>
-              <w:default w:val="[Principal Name]"/>
+              <w:default w:val="CFO"/>
             </w:textInput>
           </w:ffData>
         </w:fldChar>
@@ -2728,7 +2728,7 @@
         <w:rPr>
           <w:noProof/>
         </w:rPr>
-        <w:t>[Principal Name]</w:t>
+        <w:t>CFO</w:t>
       </w:r>
       <w:r>
         <w:fldChar w:fldCharType="end"/>
@@ -2737,7 +2737,7 @@
         <w:rPr>
           <w:highlight w:val="yellow"/>
         </w:rPr>
-        <w:t>/quality assurance</w:t>
+        <w:t/>
       </w:r>
       <w:r>
         <w:rPr>

</xml_diff>